<commit_message>
Reconciliar TP2 con la bifurcacion del Google Doc
Se decidio mantener este repo como version de trabajo de referencia frente al Google Doc que Yamil armo a partir del .docx compartido. Se adopta el ajuste de la seccion 5 (sacar el ahorro fiscal del recupero de inversion, separarlo como beneficio energetico) y se dejan sin incorporar, por ahora, los datos administrativos que el Google Doc ya fijo (organismo, responsable, fecha, tipologia).

Co-Authored-By: Claude Sonnet 5 <noreply@anthropic.com>
</commit_message>
<xml_diff>
--- a/docs/plantillas/TP2_Formulario_Perfil_Entrega2.docx
+++ b/docs/plantillas/TP2_Formulario_Perfil_Entrega2.docx
@@ -979,20 +979,6 @@
         <w:rPr>
           <w:b/>
         </w:rPr>
-        <w:t xml:space="preserve">Ahorro fiscal directo para la Provincia </w:t>
-      </w:r>
-      <w:r>
-        <w:t>por sustitución de diésel y GLP subsidiado en las usinas y edificios públicos — ya cuantificado a nivel provincial en USD 800.000-1.000.000/año (CFI 2019). Este es el mecanismo de recupero indirecto más sólido que existe, aunque conceptualmente corresponde al componente energético del proyecto, no al industrial.</w:t>
-      </w:r>
-    </w:p>
-    <w:p>
-      <w:pPr>
-        <w:pStyle w:val="ListNumber"/>
-      </w:pPr>
-      <w:r>
-        <w:rPr>
-          <w:b/>
-        </w:rPr>
         <w:t xml:space="preserve">Tarifario de servicios a aserraderos y pymes </w:t>
       </w:r>
       <w:r>
@@ -1010,7 +996,7 @@
         <w:t xml:space="preserve">Venta de productos de mayor valor agregado </w:t>
       </w:r>
       <w:r>
-        <w:t>generados en la propia planta: pellets, chips, biochar, madera clasificada y certificada.</w:t>
+        <w:t>generados en la propia planta: pellets, chips, biochar, madera clasificada y certificada. Incluye demanda institucional (usinas y edificios públicos que operen con biomasa) vía contratos de abastecimiento de mediano plazo.</w:t>
       </w:r>
     </w:p>
     <w:p>
@@ -1019,7 +1005,16 @@
           <w:i/>
           <w:color w:val="555555"/>
         </w:rPr>
-        <w:t>Pendiente: cuantificar cada uno de estos tres flujos con un modelo financiero (flujo de fondos, VAN, TIR) — corresponde a la etapa de Pre-factibilidad/Factibilidad según la Guía BFPI, no a esta entrega.</w:t>
+        <w:t>Nota: se dejó fuera de este listado el ahorro fiscal provincial por sustitución de diésel/GLP (USD 800.000-1.000.000/año, CFI 2019) — es un beneficio real y cuantificado, pero corresponde al componente energético del proyecto, no es un flujo de recupero de la inversión industrial del Polo en sí. Conviene mencionarlo en la sección de beneficios/impacto, no acá.</w:t>
+      </w:r>
+    </w:p>
+    <w:p>
+      <w:r>
+        <w:rPr>
+          <w:i/>
+          <w:color w:val="555555"/>
+        </w:rPr>
+        <w:t>Pendiente: cuantificar cada uno de estos dos flujos con un modelo financiero (flujo de fondos, VAN, TIR) — corresponde a la etapa de Pre-factibilidad/Factibilidad según la Guía BFPI, no a esta entrega.</w:t>
       </w:r>
     </w:p>
     <w:p>
@@ -1683,7 +1678,7 @@
               <w:rPr>
                 <w:sz w:val="20"/>
               </w:rPr>
-              <w:t>Los 3 mecanismos están identificados y parcialmente cuantificados</w:t>
+              <w:t>Los 2 mecanismos (tarifario + venta de productos) están identificados; el ahorro fiscal se separó como beneficio energético, no como recupero</w:t>
             </w:r>
           </w:p>
         </w:tc>

</xml_diff>